<commit_message>
feat: marketplace commerce, globalization, and ML analytics suite
- Universal marketplace order flow (ProductOrder) with pricing breakdown, promotion redemption, inventory decrement, loyalty earning, notifications, and outbox events
- PricingService transparent base+tax+service-fee breakdown with multi-currency conversion and promotion discounts
- Globalization: i18n messages, exchange rates, supported currencies/languages per tenant
- Promotions, loyalty accounts/tiers, reviews, notifications, trips (multi-stop itineraries)
- ML/analytics suite (demand forecast, recommendation, price prediction, anomaly scoring, trend report) plus NL AI data analyst
- Disruption & recovery intelligence with ops/audit endpoints
- Controllers: globalization, promotions, loyalty, reviews, notifications, trips, pricing, ops, audit, analytics
- New DB migrations V5 (commerce + globalization) and V6 (product orders); 77 tests green
</commit_message>
<xml_diff>
--- a/docs/TicketMesh_Scope_Document.docx
+++ b/docs/TicketMesh_Scope_Document.docx
@@ -45,17 +45,17 @@
     </w:p>
     <w:p>
       <w:r>
-        <w:t>&gt; This file is the authoritative, complete record of every requirement given for the</w:t>
+        <w:t>&gt; This file is the authoritative, complete record of every requirement for the</w:t>
       </w:r>
     </w:p>
     <w:p>
       <w:r>
-        <w:t>&gt; TicketMesh universal ticketing platform. It is kept in sync on every change. The final</w:t>
+        <w:t>&gt; TicketMesh universal ticketing platform. It is the single source of truth and is</w:t>
       </w:r>
     </w:p>
     <w:p>
       <w:r>
-        <w:t xml:space="preserve">&gt; </w:t>
+        <w:t xml:space="preserve">&gt; kept in sync on every change. The final </w:t>
       </w:r>
       <w:r>
         <w:rPr>
@@ -75,12 +75,37 @@
         <w:t>.pdf</w:t>
       </w:r>
       <w:r>
-        <w:t xml:space="preserve"> scope documents are rendered from this content. It also drives the</w:t>
+        <w:t xml:space="preserve"> scope documents are</w:t>
       </w:r>
     </w:p>
     <w:p>
       <w:r>
-        <w:t>&gt; reusable "platform prompt" used to build other platforms.</w:t>
+        <w:t xml:space="preserve">&gt; rendered from this content by </w:t>
+      </w:r>
+      <w:r>
+        <w:rPr>
+          <w:rFonts w:ascii="Consolas" w:hAnsi="Consolas"/>
+          <w:sz w:val="20"/>
+        </w:rPr>
+        <w:t>tools/generate_docs.py</w:t>
+      </w:r>
+      <w:r>
+        <w:t>. It also drives the reusable</w:t>
+      </w:r>
+    </w:p>
+    <w:p>
+      <w:r>
+        <w:t>&gt; "platform prompt" (</w:t>
+      </w:r>
+      <w:r>
+        <w:rPr>
+          <w:rFonts w:ascii="Consolas" w:hAnsi="Consolas"/>
+          <w:sz w:val="20"/>
+        </w:rPr>
+        <w:t>docs/PLATFORM_PROMPT_TEMPLATE.md</w:t>
+      </w:r>
+      <w:r>
+        <w:t>) used to build other products.</w:t>
       </w:r>
     </w:p>
     <w:p>
@@ -110,221 +135,1466 @@
         <w:pStyle w:val="ListBullet"/>
       </w:pPr>
       <w:r>
-        <w:t>Marketed as a global, production-standard SaaS that can be: (a) bought as software,</w:t>
+        <w:t xml:space="preserve">Brand tagline: </w:t>
+      </w:r>
+      <w:r>
+        <w:rPr>
+          <w:b/>
+        </w:rPr>
+        <w:t>"All your tickets, one platform."</w:t>
       </w:r>
     </w:p>
     <w:p>
-      <w:r>
-        <w:t>(b) self-hosted on the buyer's own server, or (c) run as a full managed service</w:t>
+      <w:pPr>
+        <w:pStyle w:val="ListBullet"/>
+      </w:pPr>
+      <w:r>
+        <w:t>Marketed as a global, production-standard SaaS that can be: (a) bought as software,</w:t>
       </w:r>
     </w:p>
     <w:p>
       <w:r>
-        <w:t>(hosting included) by us.</w:t>
+        <w:t>(b) self-hosted on the buyer's own server, or (c) run as a full managed service</w:t>
       </w:r>
     </w:p>
     <w:p>
-      <w:pPr>
-        <w:pStyle w:val="ListBullet"/>
-      </w:pPr>
-      <w:r>
-        <w:t>Target deploy targets: AWS, Kubernetes (EKS), on-premises, Docker, single server — with</w:t>
+      <w:r>
+        <w:t>(hosting included) by the vendor.</w:t>
       </w:r>
     </w:p>
     <w:p>
-      <w:r>
-        <w:t>horizontal autoscaling and easy deployment everywhere.</w:t>
+      <w:pPr>
+        <w:pStyle w:val="ListBullet"/>
+      </w:pPr>
+      <w:r>
+        <w:t>Target deploy targets: AWS, Kubernetes (EKS), on-premises, Docker, single server — with</w:t>
       </w:r>
     </w:p>
     <w:p>
-      <w:pPr>
-        <w:pStyle w:val="ListBullet"/>
-      </w:pPr>
-      <w:r>
-        <w:t>Prefer free / standard production SaaS-level tooling and self-hostable components</w:t>
+      <w:r>
+        <w:t>horizontal autoscaling and easy deployment everywhere.</w:t>
       </w:r>
     </w:p>
     <w:p>
-      <w:r>
-        <w:t>(Docker, PostgreSQL, Redis, Kafka, DuckDB, Prometheus, Grafana, local AI models).</w:t>
+      <w:pPr>
+        <w:pStyle w:val="ListBullet"/>
+      </w:pPr>
+      <w:r>
+        <w:t>Prefer free / standard production SaaS-level tooling and self-hostable components</w:t>
       </w:r>
     </w:p>
     <w:p>
-      <w:pPr>
-        <w:pStyle w:val="Heading2"/>
-      </w:pPr>
-      <w:r>
-        <w:t>1. Core scope (from master blueprint — all 53+ parts)</w:t>
+      <w:r>
+        <w:t>(Docker, PostgreSQL/H2, Redis, Kafka, DuckDB, Prometheus, Grafana, local/offline AI).</w:t>
       </w:r>
     </w:p>
     <w:p>
-      <w:r>
-        <w:t>Universal, configurable, multi-provider ticketing &amp; reservation covering **bus, train,</w:t>
+      <w:pPr>
+        <w:pStyle w:val="ListBullet"/>
+      </w:pPr>
+      <w:r>
+        <w:t>Sold as a business to any buyer: SaaS marketplace model, theme/white-label marketplace,</w:t>
       </w:r>
     </w:p>
     <w:p>
       <w:r>
-        <w:t>movie, events, sports, flight, ferry, attractions** and future domains. Key pillars:</w:t>
+        <w:t>managed-service offering, and on-prem licensing (WordPress-marketplace-like).</w:t>
       </w:r>
     </w:p>
     <w:p>
-      <w:r>
-        <w:t>1. Universal ticket model: TicketProduct, TicketType, Provider, Inventory, Offer,</w:t>
+      <w:pPr>
+        <w:pStyle w:val="Heading2"/>
+      </w:pPr>
+      <w:r>
+        <w:t>1. Core scope — the full 53-part master blueprint</w:t>
       </w:r>
     </w:p>
     <w:p>
       <w:r>
-        <w:t>Reservation, Booking, Ticket, Policy.</w:t>
+        <w:t>The blueprint is not compressed here. Every one of the 53 parts is retained and tracked.</w:t>
       </w:r>
     </w:p>
     <w:p>
       <w:r>
-        <w:t>2. Multi-domain support (bus seats, train berths/classes, movie shows, event/sports seats).</w:t>
+        <w:t xml:space="preserve">Honest per-part status lives in </w:t>
+      </w:r>
+      <w:r>
+        <w:rPr>
+          <w:rFonts w:ascii="Consolas" w:hAnsi="Consolas"/>
+          <w:sz w:val="20"/>
+        </w:rPr>
+        <w:t>docs/blueprint-coverage.md</w:t>
+      </w:r>
+      <w:r>
+        <w:t xml:space="preserve"> (BUILT / PARTIAL / DOC / PLANNED).</w:t>
       </w:r>
     </w:p>
     <w:p>
-      <w:r>
-        <w:t>3. Multi-provider aggregation: parallel search, normalize, dedupe, compare, rank.</w:t>
+      <w:pPr>
+        <w:pStyle w:val="Heading3"/>
+      </w:pPr>
+      <w:r>
+        <w:t>Part 1 — Product Vision &amp; Scope</w:t>
       </w:r>
     </w:p>
     <w:p>
-      <w:r>
-        <w:t>4. Provider adapter framework: search, availability, seat map, price, hold, release, book,</w:t>
+      <w:pPr>
+        <w:pStyle w:val="ListBullet"/>
+      </w:pPr>
+      <w:r>
+        <w:t>Universal, configurable, multi-provider ticketing &amp; reservation platform.</w:t>
       </w:r>
     </w:p>
     <w:p>
-      <w:r>
-        <w:t>confirm, get booking, cancel, refund, modify, ticket retrieval, validation.</w:t>
+      <w:pPr>
+        <w:pStyle w:val="ListBullet"/>
+      </w:pPr>
+      <w:r>
+        <w:t>Buy-as-software / self-host / managed-service with hosting.</w:t>
       </w:r>
     </w:p>
     <w:p>
-      <w:r>
-        <w:t>5. Provider onboarding + capability system (providers declare supported capabilities).</w:t>
+      <w:pPr>
+        <w:pStyle w:val="ListBullet"/>
+      </w:pPr>
+      <w:r>
+        <w:t>Sellable production standard; portfolio + visa evidence; startup/SaaS path.</w:t>
       </w:r>
     </w:p>
     <w:p>
-      <w:r>
-        <w:t>6. Configuration-driven product engine (no-code/low-code) — workflows, fields, seats,</w:t>
+      <w:pPr>
+        <w:pStyle w:val="Heading3"/>
+      </w:pPr>
+      <w:r>
+        <w:t>Part 2 — Global Benchmark &amp; Product Positioning</w:t>
       </w:r>
     </w:p>
     <w:p>
-      <w:r>
-        <w:t>policies, fees, taxes, promotions, notifications, validation, all configurable.</w:t>
+      <w:pPr>
+        <w:pStyle w:val="ListBullet"/>
+      </w:pPr>
+      <w:r>
+        <w:t>Benchmarked against global ticketing/reservation leaders and OTA aggregators.</w:t>
       </w:r>
     </w:p>
     <w:p>
-      <w:r>
-        <w:t>7. Universal search; AI conversational search; multi-ticket/multi-service Trip; smart trip</w:t>
+      <w:pPr>
+        <w:pStyle w:val="ListBullet"/>
+      </w:pPr>
+      <w:r>
+        <w:t>Differentiator: universal multi-domain aggregation + white-label SaaS + AI/ML + no-code.</w:t>
       </w:r>
     </w:p>
     <w:p>
-      <w:r>
-        <w:t>planner.</w:t>
+      <w:pPr>
+        <w:pStyle w:val="Heading3"/>
+      </w:pPr>
+      <w:r>
+        <w:t>Part 3 — Universal Ticketing Model</w:t>
       </w:r>
     </w:p>
     <w:p>
-      <w:r>
-        <w:t>8. Inventory management (AVAILABLE -&gt; HELD -&gt; CONFIRMED; HELD -&gt; EXPIRED -&gt; AVAILABLE).</w:t>
+      <w:pPr>
+        <w:pStyle w:val="ListBullet"/>
+      </w:pPr>
+      <w:r>
+        <w:t xml:space="preserve">Core entities: </w:t>
+      </w:r>
+      <w:r>
+        <w:rPr>
+          <w:rFonts w:ascii="Consolas" w:hAnsi="Consolas"/>
+          <w:sz w:val="20"/>
+        </w:rPr>
+        <w:t>Tenant</w:t>
+      </w:r>
+      <w:r>
+        <w:t xml:space="preserve">, </w:t>
+      </w:r>
+      <w:r>
+        <w:rPr>
+          <w:rFonts w:ascii="Consolas" w:hAnsi="Consolas"/>
+          <w:sz w:val="20"/>
+        </w:rPr>
+        <w:t>TenantBranding</w:t>
+      </w:r>
+      <w:r>
+        <w:t xml:space="preserve">, </w:t>
+      </w:r>
+      <w:r>
+        <w:rPr>
+          <w:rFonts w:ascii="Consolas" w:hAnsi="Consolas"/>
+          <w:sz w:val="20"/>
+        </w:rPr>
+        <w:t>Provider</w:t>
+      </w:r>
+      <w:r>
+        <w:t xml:space="preserve">, </w:t>
+      </w:r>
+      <w:r>
+        <w:rPr>
+          <w:rFonts w:ascii="Consolas" w:hAnsi="Consolas"/>
+          <w:sz w:val="20"/>
+        </w:rPr>
+        <w:t>ProviderProduct</w:t>
+      </w:r>
+      <w:r>
+        <w:t xml:space="preserve"> (ticket product),</w:t>
       </w:r>
     </w:p>
     <w:p>
       <w:r>
-        <w:t>9. Reservation &amp; concurrency (idempotency keys, optimistic locking, expiry, reconciliation).</w:t>
+        <w:rPr>
+          <w:rFonts w:ascii="Consolas" w:hAnsi="Consolas"/>
+          <w:sz w:val="20"/>
+        </w:rPr>
+        <w:t>TicketType</w:t>
+      </w:r>
+      <w:r>
+        <w:t xml:space="preserve">, </w:t>
+      </w:r>
+      <w:r>
+        <w:rPr>
+          <w:rFonts w:ascii="Consolas" w:hAnsi="Consolas"/>
+          <w:sz w:val="20"/>
+        </w:rPr>
+        <w:t>Inventory</w:t>
+      </w:r>
+      <w:r>
+        <w:t xml:space="preserve">, </w:t>
+      </w:r>
+      <w:r>
+        <w:rPr>
+          <w:rFonts w:ascii="Consolas" w:hAnsi="Consolas"/>
+          <w:sz w:val="20"/>
+        </w:rPr>
+        <w:t>Offer</w:t>
+      </w:r>
+      <w:r>
+        <w:t xml:space="preserve">, </w:t>
+      </w:r>
+      <w:r>
+        <w:rPr>
+          <w:rFonts w:ascii="Consolas" w:hAnsi="Consolas"/>
+          <w:sz w:val="20"/>
+        </w:rPr>
+        <w:t>Reservation</w:t>
+      </w:r>
+      <w:r>
+        <w:t xml:space="preserve">, </w:t>
+      </w:r>
+      <w:r>
+        <w:rPr>
+          <w:rFonts w:ascii="Consolas" w:hAnsi="Consolas"/>
+          <w:sz w:val="20"/>
+        </w:rPr>
+        <w:t>Booking</w:t>
+      </w:r>
+      <w:r>
+        <w:t xml:space="preserve">, </w:t>
+      </w:r>
+      <w:r>
+        <w:rPr>
+          <w:rFonts w:ascii="Consolas" w:hAnsi="Consolas"/>
+          <w:sz w:val="20"/>
+        </w:rPr>
+        <w:t>Ticket</w:t>
+      </w:r>
+      <w:r>
+        <w:t xml:space="preserve">, </w:t>
+      </w:r>
+      <w:r>
+        <w:rPr>
+          <w:rFonts w:ascii="Consolas" w:hAnsi="Consolas"/>
+          <w:sz w:val="20"/>
+        </w:rPr>
+        <w:t>Policy</w:t>
+      </w:r>
+      <w:r>
+        <w:t>,</w:t>
       </w:r>
     </w:p>
     <w:p>
       <w:r>
-        <w:t>10. Booking engine, payment abstraction (cards/wallets/bank/refunds/webhooks), refund &amp;</w:t>
+        <w:rPr>
+          <w:rFonts w:ascii="Consolas" w:hAnsi="Consolas"/>
+          <w:sz w:val="20"/>
+        </w:rPr>
+        <w:t>Price</w:t>
+      </w:r>
+      <w:r>
+        <w:t xml:space="preserve">, </w:t>
+      </w:r>
+      <w:r>
+        <w:rPr>
+          <w:rFonts w:ascii="Consolas" w:hAnsi="Consolas"/>
+          <w:sz w:val="20"/>
+        </w:rPr>
+        <w:t>Fare</w:t>
+      </w:r>
+      <w:r>
+        <w:t xml:space="preserve">, </w:t>
+      </w:r>
+      <w:r>
+        <w:rPr>
+          <w:rFonts w:ascii="Consolas" w:hAnsi="Consolas"/>
+          <w:sz w:val="20"/>
+        </w:rPr>
+        <w:t>Addition/Fee</w:t>
+      </w:r>
+      <w:r>
+        <w:t xml:space="preserve">, </w:t>
+      </w:r>
+      <w:r>
+        <w:rPr>
+          <w:rFonts w:ascii="Consolas" w:hAnsi="Consolas"/>
+          <w:sz w:val="20"/>
+        </w:rPr>
+        <w:t>Tax</w:t>
+      </w:r>
+      <w:r>
+        <w:t xml:space="preserve">, </w:t>
+      </w:r>
+      <w:r>
+        <w:rPr>
+          <w:rFonts w:ascii="Consolas" w:hAnsi="Consolas"/>
+          <w:sz w:val="20"/>
+        </w:rPr>
+        <w:t>Promotion</w:t>
+      </w:r>
+      <w:r>
+        <w:t xml:space="preserve">, </w:t>
+      </w:r>
+      <w:r>
+        <w:rPr>
+          <w:rFonts w:ascii="Consolas" w:hAnsi="Consolas"/>
+          <w:sz w:val="20"/>
+        </w:rPr>
+        <w:t>Review</w:t>
+      </w:r>
+      <w:r>
+        <w:t xml:space="preserve">, </w:t>
+      </w:r>
+      <w:r>
+        <w:rPr>
+          <w:rFonts w:ascii="Consolas" w:hAnsi="Consolas"/>
+          <w:sz w:val="20"/>
+        </w:rPr>
+        <w:t>LoyaltyAccount</w:t>
+      </w:r>
+      <w:r>
+        <w:t>.</w:t>
       </w:r>
     </w:p>
     <w:p>
-      <w:r>
-        <w:t>cancellation, ticket issuing &amp; validation (QR/barcode), pricing &amp; fare engine,</w:t>
+      <w:pPr>
+        <w:pStyle w:val="Heading3"/>
+      </w:pPr>
+      <w:r>
+        <w:t>Part 4 — Multi-Domain Support</w:t>
       </w:r>
     </w:p>
     <w:p>
-      <w:r>
-        <w:t>promotion engine, customer &amp; loyalty.</w:t>
+      <w:pPr>
+        <w:pStyle w:val="ListBullet"/>
+      </w:pPr>
+      <w:r>
+        <w:t>Domains: bus, train, movie, events, sports, flight, ferry, attractions, activities —</w:t>
       </w:r>
     </w:p>
     <w:p>
       <w:r>
-        <w:t>11. Admin &amp; operations console; no-code/low-code configuration; multi-tenancy SaaS.</w:t>
+        <w:t xml:space="preserve">each represented by configurable </w:t>
+      </w:r>
+      <w:r>
+        <w:rPr>
+          <w:rFonts w:ascii="Consolas" w:hAnsi="Consolas"/>
+          <w:sz w:val="20"/>
+        </w:rPr>
+        <w:t>TicketType</w:t>
+      </w:r>
+      <w:r>
+        <w:t xml:space="preserve"> + capability + seat-layout semantics.</w:t>
       </w:r>
     </w:p>
     <w:p>
-      <w:r>
-        <w:t>12. AI assistant; AI agent architecture (controlled tools, least privilege, financial</w:t>
+      <w:pPr>
+        <w:pStyle w:val="Heading3"/>
+      </w:pPr>
+      <w:r>
+        <w:t>Part 5 — Multi-Provider Aggregation</w:t>
       </w:r>
     </w:p>
     <w:p>
-      <w:r>
-        <w:t>confirmation, audit); recommendation engine; seat recommendation; price prediction;</w:t>
+      <w:pPr>
+        <w:pStyle w:val="ListBullet"/>
+      </w:pPr>
+      <w:r>
+        <w:t>Parallel search across connected providers; normalize, dedupe, compare, rank, sort.</w:t>
       </w:r>
     </w:p>
     <w:p>
-      <w:r>
-        <w:t>dynamic pricing; fraud &amp; cyber risk; disruption/recovery intelligence.</w:t>
+      <w:pPr>
+        <w:pStyle w:val="ListBullet"/>
+      </w:pPr>
+      <w:r>
+        <w:t xml:space="preserve">Universal </w:t>
+      </w:r>
+      <w:r>
+        <w:rPr>
+          <w:rFonts w:ascii="Consolas" w:hAnsi="Consolas"/>
+          <w:sz w:val="20"/>
+        </w:rPr>
+        <w:t>UniversalOffer</w:t>
+      </w:r>
+      <w:r>
+        <w:t xml:space="preserve"> normalized view regardless of source provider.</w:t>
       </w:r>
     </w:p>
     <w:p>
-      <w:r>
-        <w:t>13. Ticket intelligence / data analytics; AI data analyst (read-only semantic layer).</w:t>
+      <w:pPr>
+        <w:pStyle w:val="Heading3"/>
+      </w:pPr>
+      <w:r>
+        <w:t>Part 6 — Provider Adapter Framework</w:t>
       </w:r>
     </w:p>
     <w:p>
-      <w:r>
-        <w:t>14. Data platform (Kafka -&gt; analytics; Postgres; Parquet/DuckDB offline; S3).</w:t>
+      <w:pPr>
+        <w:pStyle w:val="ListBullet"/>
+      </w:pPr>
+      <w:r>
+        <w:t>Adapter contract covering: search, availability, seat-map, price, hold, release, book,</w:t>
       </w:r>
     </w:p>
     <w:p>
       <w:r>
-        <w:t>15. ML platform (demand forecasting, cancellation prediction, fraud scoring, recommender,</w:t>
+        <w:t>confirm, get-booking, cancel, refund, modify, ticket-retrieval, validation.</w:t>
       </w:r>
     </w:p>
     <w:p>
-      <w:r>
-        <w:t>anomaly detection). Event-driven architecture. Microservices + API gateway/edge.</w:t>
+      <w:pPr>
+        <w:pStyle w:val="ListBullet"/>
+      </w:pPr>
+      <w:r>
+        <w:rPr>
+          <w:rFonts w:ascii="Consolas" w:hAnsi="Consolas"/>
+          <w:sz w:val="20"/>
+        </w:rPr>
+        <w:t>ProviderOfferClient</w:t>
+      </w:r>
+      <w:r>
+        <w:t xml:space="preserve"> (RestClient) + WireMock stubs for offline dev.</w:t>
       </w:r>
     </w:p>
     <w:p>
-      <w:r>
-        <w:t>16. Security architecture (OAuth2/OIDC, RBAC/ABAC, tenant isolation, encryption, secrets,</w:t>
+      <w:pPr>
+        <w:pStyle w:val="Heading3"/>
+      </w:pPr>
+      <w:r>
+        <w:t>Part 7 — Provider Onboarding</w:t>
       </w:r>
     </w:p>
     <w:p>
-      <w:r>
-        <w:t>audit, rate limiting, mTLS, PII minimization, zero-trust).</w:t>
+      <w:pPr>
+        <w:pStyle w:val="ListBullet"/>
+      </w:pPr>
+      <w:r>
+        <w:t>Provider registration + capability declaration + credentials + status (active/suspended).</w:t>
       </w:r>
     </w:p>
     <w:p>
-      <w:r>
-        <w:t>17. AI security (prompt-injection defense, PII redaction, tool authorization, output</w:t>
+      <w:pPr>
+        <w:pStyle w:val="Heading3"/>
+      </w:pPr>
+      <w:r>
+        <w:t>Part 8 — Capability System</w:t>
       </w:r>
     </w:p>
     <w:p>
-      <w:r>
-        <w:t>validation, retrieval filtering, DLP, model allowlists, audit, adversarial eval).</w:t>
+      <w:pPr>
+        <w:pStyle w:val="ListBullet"/>
+      </w:pPr>
+      <w:r>
+        <w:t>Providers declare supported capabilities; client routes only to capable providers.</w:t>
       </w:r>
     </w:p>
     <w:p>
-      <w:r>
-        <w:t>18. DevOps/DevSecOps, CI/CD, Kubernetes &amp; GitOps (EKS, Helm, Argo CD/Rollouts, KEDA, HPA),</w:t>
+      <w:pPr>
+        <w:pStyle w:val="ListBullet"/>
+      </w:pPr>
+      <w:r>
+        <w:t>Capabilities: SEARCH, AVAILABILITY, SEAT_MAP, HOLD, BOOK, CANCEL, REFUND, MODIFY,</w:t>
       </w:r>
     </w:p>
     <w:p>
       <w:r>
-        <w:t>AWS architecture, free/offline dev strategy.</w:t>
+        <w:t>TICKET_RETRIEVAL, VALIDATION, DYNAMIC_PRICING.</w:t>
       </w:r>
     </w:p>
     <w:p>
-      <w:r>
-        <w:t>19. Frontends: React + TypeScript web (consumer + admin); optional React Native mobile</w:t>
+      <w:pPr>
+        <w:pStyle w:val="Heading3"/>
+      </w:pPr>
+      <w:r>
+        <w:t>Part 9 — Configuration-Driven Product Engine</w:t>
       </w:r>
     </w:p>
     <w:p>
-      <w:r>
-        <w:t>later. Testing &amp; quality, observability, monorepo layout, delivery roadmap, MVP + DoD.</w:t>
+      <w:pPr>
+        <w:pStyle w:val="ListBullet"/>
+      </w:pPr>
+      <w:r>
+        <w:t>No-code/low-code: ticket products, ticket types, fields, seat layouts, policies, fees,</w:t>
+      </w:r>
+    </w:p>
+    <w:p>
+      <w:r>
+        <w:t>taxes, promotions, notifications, validations — all configuration-driven via admin,</w:t>
+      </w:r>
+    </w:p>
+    <w:p>
+      <w:r>
+        <w:t>no code changes required.</w:t>
+      </w:r>
+    </w:p>
+    <w:p>
+      <w:pPr>
+        <w:pStyle w:val="Heading3"/>
+      </w:pPr>
+      <w:r>
+        <w:t>Part 10 — Universal Search</w:t>
+      </w:r>
+    </w:p>
+    <w:p>
+      <w:pPr>
+        <w:pStyle w:val="ListBullet"/>
+      </w:pPr>
+      <w:r>
+        <w:t>Unified search across all products/domains/providers with filters, sort, range, day.</w:t>
+      </w:r>
+    </w:p>
+    <w:p>
+      <w:pPr>
+        <w:pStyle w:val="Heading3"/>
+      </w:pPr>
+      <w:r>
+        <w:t>Part 11 — AI Conversational Search</w:t>
+      </w:r>
+    </w:p>
+    <w:p>
+      <w:pPr>
+        <w:pStyle w:val="ListBullet"/>
+      </w:pPr>
+      <w:r>
+        <w:t>Natural-language booking intent: e.g. "bus from Colombo to Kandy tomorrow 6 pm".</w:t>
+      </w:r>
+    </w:p>
+    <w:p>
+      <w:pPr>
+        <w:pStyle w:val="ListBullet"/>
+      </w:pPr>
+      <w:r>
+        <w:t>Offline-first intent parse + provider search + ranked offer response.</w:t>
+      </w:r>
+    </w:p>
+    <w:p>
+      <w:pPr>
+        <w:pStyle w:val="Heading3"/>
+      </w:pPr>
+      <w:r>
+        <w:t>Part 12 — Multi-Ticket / Multi-Service Trip</w:t>
+      </w:r>
+    </w:p>
+    <w:p>
+      <w:pPr>
+        <w:pStyle w:val="ListBullet"/>
+      </w:pPr>
+      <w:r>
+        <w:t xml:space="preserve">A </w:t>
+      </w:r>
+      <w:r>
+        <w:rPr>
+          <w:rFonts w:ascii="Consolas" w:hAnsi="Consolas"/>
+          <w:sz w:val="20"/>
+        </w:rPr>
+        <w:t>Trip</w:t>
+      </w:r>
+      <w:r>
+        <w:t xml:space="preserve"> bundles multiple bookings/tickets across domains into one itinerary.</w:t>
+      </w:r>
+    </w:p>
+    <w:p>
+      <w:pPr>
+        <w:pStyle w:val="Heading3"/>
+      </w:pPr>
+      <w:r>
+        <w:t>Part 13 — Smart Trip Planner</w:t>
+      </w:r>
+    </w:p>
+    <w:p>
+      <w:pPr>
+        <w:pStyle w:val="ListBullet"/>
+      </w:pPr>
+      <w:r>
+        <w:t>Cross-domain journey planning (bus+train+event) with ordering and optimization hints.</w:t>
+      </w:r>
+    </w:p>
+    <w:p>
+      <w:pPr>
+        <w:pStyle w:val="Heading3"/>
+      </w:pPr>
+      <w:r>
+        <w:t>Part 14 — Inventory Management</w:t>
+      </w:r>
+    </w:p>
+    <w:p>
+      <w:pPr>
+        <w:pStyle w:val="ListBullet"/>
+      </w:pPr>
+      <w:r>
+        <w:t xml:space="preserve">Inventory state machine: </w:t>
+      </w:r>
+      <w:r>
+        <w:rPr>
+          <w:rFonts w:ascii="Consolas" w:hAnsi="Consolas"/>
+          <w:sz w:val="20"/>
+        </w:rPr>
+        <w:t>AVAILABLE -&gt; HELD -&gt; CONFIRMED</w:t>
+      </w:r>
+      <w:r>
+        <w:t xml:space="preserve">; </w:t>
+      </w:r>
+      <w:r>
+        <w:rPr>
+          <w:rFonts w:ascii="Consolas" w:hAnsi="Consolas"/>
+          <w:sz w:val="20"/>
+        </w:rPr>
+        <w:t>HELD -&gt; EXPIRED -&gt; AVAILABLE</w:t>
+      </w:r>
+      <w:r>
+        <w:t>.</w:t>
+      </w:r>
+    </w:p>
+    <w:p>
+      <w:pPr>
+        <w:pStyle w:val="ListBullet"/>
+      </w:pPr>
+      <w:r>
+        <w:t>Seat maps per product; per-tenant isolation; optimistic concurrency.</w:t>
+      </w:r>
+    </w:p>
+    <w:p>
+      <w:pPr>
+        <w:pStyle w:val="Heading3"/>
+      </w:pPr>
+      <w:r>
+        <w:t>Part 15 — Reservation &amp; Concurrency</w:t>
+      </w:r>
+    </w:p>
+    <w:p>
+      <w:pPr>
+        <w:pStyle w:val="ListBullet"/>
+      </w:pPr>
+      <w:r>
+        <w:t>Idempotency keys, optimistic locking, hold expiry, reservation release scheduler,</w:t>
+      </w:r>
+    </w:p>
+    <w:p>
+      <w:r>
+        <w:t>reconciliation — prevent double-selling at scale.</w:t>
+      </w:r>
+    </w:p>
+    <w:p>
+      <w:pPr>
+        <w:pStyle w:val="Heading3"/>
+      </w:pPr>
+      <w:r>
+        <w:t>Part 16 — Booking Engine</w:t>
+      </w:r>
+    </w:p>
+    <w:p>
+      <w:pPr>
+        <w:pStyle w:val="ListBullet"/>
+      </w:pPr>
+      <w:r>
+        <w:t>Universal booking flow: offer -&gt; hold -&gt; payment -&gt; confirm -&gt; issue ticket.</w:t>
+      </w:r>
+    </w:p>
+    <w:p>
+      <w:pPr>
+        <w:pStyle w:val="ListBullet"/>
+      </w:pPr>
+      <w:r>
+        <w:t>Bookings across all domains through one engine.</w:t>
+      </w:r>
+    </w:p>
+    <w:p>
+      <w:pPr>
+        <w:pStyle w:val="Heading3"/>
+      </w:pPr>
+      <w:r>
+        <w:t>Part 17 — Payment Abstraction</w:t>
+      </w:r>
+    </w:p>
+    <w:p>
+      <w:pPr>
+        <w:pStyle w:val="ListBullet"/>
+      </w:pPr>
+      <w:r>
+        <w:t>Payment provider abstraction: cards, wallets, bank, refunds, webhooks.</w:t>
+      </w:r>
+    </w:p>
+    <w:p>
+      <w:pPr>
+        <w:pStyle w:val="ListBullet"/>
+      </w:pPr>
+      <w:r>
+        <w:t>Pluggable payment gateway adapters (WireMock-stubbed in dev); async status poll/webhook.</w:t>
+      </w:r>
+    </w:p>
+    <w:p>
+      <w:pPr>
+        <w:pStyle w:val="Heading3"/>
+      </w:pPr>
+      <w:r>
+        <w:t>Part 18 — Refund &amp; Cancellation</w:t>
+      </w:r>
+    </w:p>
+    <w:p>
+      <w:pPr>
+        <w:pStyle w:val="ListBullet"/>
+      </w:pPr>
+      <w:r>
+        <w:t>Cancellation policies per product/ticket-type; refund calculation; partial refunds.</w:t>
+      </w:r>
+    </w:p>
+    <w:p>
+      <w:pPr>
+        <w:pStyle w:val="Heading3"/>
+      </w:pPr>
+      <w:r>
+        <w:t>Part 19 — Ticket Issuing &amp; Validation</w:t>
+      </w:r>
+    </w:p>
+    <w:p>
+      <w:pPr>
+        <w:pStyle w:val="ListBullet"/>
+      </w:pPr>
+      <w:r>
+        <w:t xml:space="preserve">Issue QR/barcode tickets deterministically (ZXing); </w:t>
+      </w:r>
+      <w:r>
+        <w:rPr>
+          <w:rFonts w:ascii="Consolas" w:hAnsi="Consolas"/>
+          <w:sz w:val="20"/>
+        </w:rPr>
+        <w:t>/api/tickets/{id}/validate</w:t>
+      </w:r>
+      <w:r>
+        <w:t xml:space="preserve"> for</w:t>
+      </w:r>
+    </w:p>
+    <w:p>
+      <w:r>
+        <w:t>gate validation; secure, tamper-evident payload.</w:t>
+      </w:r>
+    </w:p>
+    <w:p>
+      <w:pPr>
+        <w:pStyle w:val="Heading3"/>
+      </w:pPr>
+      <w:r>
+        <w:t>Part 20 — Pricing &amp; Fare Engine</w:t>
+      </w:r>
+    </w:p>
+    <w:p>
+      <w:pPr>
+        <w:pStyle w:val="ListBullet"/>
+      </w:pPr>
+      <w:r>
+        <w:t>Base price + configurable fare components: fees, taxes, service fees, currency;</w:t>
+      </w:r>
+    </w:p>
+    <w:p>
+      <w:r>
+        <w:t xml:space="preserve">price as </w:t>
+      </w:r>
+      <w:r>
+        <w:rPr>
+          <w:rFonts w:ascii="Consolas" w:hAnsi="Consolas"/>
+          <w:sz w:val="20"/>
+        </w:rPr>
+        <w:t>CurrencyAmount</w:t>
+      </w:r>
+      <w:r>
+        <w:t xml:space="preserve"> (atomic currency + amount); multi-currency aware.</w:t>
+      </w:r>
+    </w:p>
+    <w:p>
+      <w:pPr>
+        <w:pStyle w:val="Heading3"/>
+      </w:pPr>
+      <w:r>
+        <w:t>Part 21 — Promotion Engine</w:t>
+      </w:r>
+    </w:p>
+    <w:p>
+      <w:pPr>
+        <w:pStyle w:val="ListBullet"/>
+      </w:pPr>
+      <w:r>
+        <w:t>Coupons and promo rules (percentage / flat / min-purchase), scoped to tenant/domain;</w:t>
+      </w:r>
+    </w:p>
+    <w:p>
+      <w:r>
+        <w:t>applied at checkout, validated, single use per booking.</w:t>
+      </w:r>
+    </w:p>
+    <w:p>
+      <w:pPr>
+        <w:pStyle w:val="Heading3"/>
+      </w:pPr>
+      <w:r>
+        <w:t>Part 22 — Customer &amp; Loyalty</w:t>
+      </w:r>
+    </w:p>
+    <w:p>
+      <w:pPr>
+        <w:pStyle w:val="ListBullet"/>
+      </w:pPr>
+      <w:r>
+        <w:t>Loyalty accounts per customer; earn points on bookings; levels; redeemable.</w:t>
+      </w:r>
+    </w:p>
+    <w:p>
+      <w:pPr>
+        <w:pStyle w:val="ListBullet"/>
+      </w:pPr>
+      <w:r>
+        <w:t>Customer self-serve + agent-facilitated purchase both supported.</w:t>
+      </w:r>
+    </w:p>
+    <w:p>
+      <w:pPr>
+        <w:pStyle w:val="Heading3"/>
+      </w:pPr>
+      <w:r>
+        <w:t>Part 23 — Admin &amp; Operations Console</w:t>
+      </w:r>
+    </w:p>
+    <w:p>
+      <w:pPr>
+        <w:pStyle w:val="ListBullet"/>
+      </w:pPr>
+      <w:r>
+        <w:t>Admin portal: manage tenants, providers, agents, shops, products, monitor system,</w:t>
+      </w:r>
+    </w:p>
+    <w:p>
+      <w:r>
+        <w:t>view analytics, audit, support, security ops.</w:t>
+      </w:r>
+    </w:p>
+    <w:p>
+      <w:pPr>
+        <w:pStyle w:val="Heading3"/>
+      </w:pPr>
+      <w:r>
+        <w:t>Part 24 — No-Code / Low-Code Configuration</w:t>
+      </w:r>
+    </w:p>
+    <w:p>
+      <w:pPr>
+        <w:pStyle w:val="ListBullet"/>
+      </w:pPr>
+      <w:r>
+        <w:t>Admin UI + API to configure themes, products, fees, policies — no code.</w:t>
+      </w:r>
+    </w:p>
+    <w:p>
+      <w:pPr>
+        <w:pStyle w:val="Heading3"/>
+      </w:pPr>
+      <w:r>
+        <w:t>Part 25 — Multi-Tenancy SaaS</w:t>
+      </w:r>
+    </w:p>
+    <w:p>
+      <w:pPr>
+        <w:pStyle w:val="ListBullet"/>
+      </w:pPr>
+      <w:r>
+        <w:t>Tenant isolation (data scoping by tenant), per-tenant white-label branding, per-tenant</w:t>
+      </w:r>
+    </w:p>
+    <w:p>
+      <w:r>
+        <w:t>configuration, per-tenant currency/language/locale, subscription status.</w:t>
+      </w:r>
+    </w:p>
+    <w:p>
+      <w:pPr>
+        <w:pStyle w:val="Heading3"/>
+      </w:pPr>
+      <w:r>
+        <w:t>Part 26 — AI Assistant</w:t>
+      </w:r>
+    </w:p>
+    <w:p>
+      <w:pPr>
+        <w:pStyle w:val="ListBullet"/>
+      </w:pPr>
+      <w:r>
+        <w:t>Conversational assistant (offline-first deterministic model; adapter for LLM later).</w:t>
+      </w:r>
+    </w:p>
+    <w:p>
+      <w:pPr>
+        <w:pStyle w:val="Heading3"/>
+      </w:pPr>
+      <w:r>
+        <w:t>Part 27 — AI Agent Architecture</w:t>
+      </w:r>
+    </w:p>
+    <w:p>
+      <w:pPr>
+        <w:pStyle w:val="ListBullet"/>
+      </w:pPr>
+      <w:r>
+        <w:t>Controlled tools, least privilege, financial confirmation, audit trail of tool calls.</w:t>
+      </w:r>
+    </w:p>
+    <w:p>
+      <w:pPr>
+        <w:pStyle w:val="Heading3"/>
+      </w:pPr>
+      <w:r>
+        <w:t>Part 28 — AI Recommendation Engine</w:t>
+      </w:r>
+    </w:p>
+    <w:p>
+      <w:pPr>
+        <w:pStyle w:val="ListBullet"/>
+      </w:pPr>
+      <w:r>
+        <w:t>Product/service recommendations from history + popularity (offline deterministic + ML).</w:t>
+      </w:r>
+    </w:p>
+    <w:p>
+      <w:pPr>
+        <w:pStyle w:val="Heading3"/>
+      </w:pPr>
+      <w:r>
+        <w:t>Part 29 — AI Seat Recommendation</w:t>
+      </w:r>
+    </w:p>
+    <w:p>
+      <w:pPr>
+        <w:pStyle w:val="ListBullet"/>
+      </w:pPr>
+      <w:r>
+        <w:t>Suggest seats from preference/layout heuristics (offline).</w:t>
+      </w:r>
+    </w:p>
+    <w:p>
+      <w:pPr>
+        <w:pStyle w:val="Heading3"/>
+      </w:pPr>
+      <w:r>
+        <w:t>Part 30 — AI Price Prediction</w:t>
+      </w:r>
+    </w:p>
+    <w:p>
+      <w:pPr>
+        <w:pStyle w:val="ListBullet"/>
+      </w:pPr>
+      <w:r>
+        <w:t>Predict future price moves from trend/heuristic model (offline + ML).</w:t>
+      </w:r>
+    </w:p>
+    <w:p>
+      <w:pPr>
+        <w:pStyle w:val="Heading3"/>
+      </w:pPr>
+      <w:r>
+        <w:t>Part 31 — Dynamic Pricing Intelligence</w:t>
+      </w:r>
+    </w:p>
+    <w:p>
+      <w:pPr>
+        <w:pStyle w:val="ListBullet"/>
+      </w:pPr>
+      <w:r>
+        <w:t>Configurable fare rules / surge heuristics applied at pricing time.</w:t>
+      </w:r>
+    </w:p>
+    <w:p>
+      <w:pPr>
+        <w:pStyle w:val="Heading3"/>
+      </w:pPr>
+      <w:r>
+        <w:t>Part 32 — AI Fraud &amp; Cyber Risk</w:t>
+      </w:r>
+    </w:p>
+    <w:p>
+      <w:pPr>
+        <w:pStyle w:val="ListBullet"/>
+      </w:pPr>
+      <w:r>
+        <w:t>Fraud scoring 0-100, signals, auto-block &gt;= threshold, admin override, audit.</w:t>
+      </w:r>
+    </w:p>
+    <w:p>
+      <w:pPr>
+        <w:pStyle w:val="ListBullet"/>
+      </w:pPr>
+      <w:r>
+        <w:t>Cyber-risk awareness integrated with security ops.</w:t>
+      </w:r>
+    </w:p>
+    <w:p>
+      <w:pPr>
+        <w:pStyle w:val="Heading3"/>
+      </w:pPr>
+      <w:r>
+        <w:t>Part 33 — Disruption &amp; Recovery Intelligence</w:t>
+      </w:r>
+    </w:p>
+    <w:p>
+      <w:pPr>
+        <w:pStyle w:val="ListBullet"/>
+      </w:pPr>
+      <w:r>
+        <w:t>Detect disruption indicators (route/service changes) and propose recovery options.</w:t>
+      </w:r>
+    </w:p>
+    <w:p>
+      <w:pPr>
+        <w:pStyle w:val="Heading3"/>
+      </w:pPr>
+      <w:r>
+        <w:t>Part 34 — Ticket Intelligence / Data Analytics</w:t>
+      </w:r>
+    </w:p>
+    <w:p>
+      <w:pPr>
+        <w:pStyle w:val="ListBullet"/>
+      </w:pPr>
+      <w:r>
+        <w:t>Trend analytics: bookings, revenue, demand, top products/domains, retention.</w:t>
+      </w:r>
+    </w:p>
+    <w:p>
+      <w:pPr>
+        <w:pStyle w:val="Heading3"/>
+      </w:pPr>
+      <w:r>
+        <w:t>Part 35 — AI Data Analyst</w:t>
+      </w:r>
+    </w:p>
+    <w:p>
+      <w:pPr>
+        <w:pStyle w:val="ListBullet"/>
+      </w:pPr>
+      <w:r>
+        <w:t>Natural-language questions over a read-only semantic warehouse layer (offline).</w:t>
+      </w:r>
+    </w:p>
+    <w:p>
+      <w:pPr>
+        <w:pStyle w:val="Heading3"/>
+      </w:pPr>
+      <w:r>
+        <w:t>Part 36 — Data Platform</w:t>
+      </w:r>
+    </w:p>
+    <w:p>
+      <w:pPr>
+        <w:pStyle w:val="ListBullet"/>
+      </w:pPr>
+      <w:r>
+        <w:t>Event-capture (outbox/events), analytics warehouse, Parquet/DuckDB offline, S3 option.</w:t>
+      </w:r>
+    </w:p>
+    <w:p>
+      <w:pPr>
+        <w:pStyle w:val="Heading3"/>
+      </w:pPr>
+      <w:r>
+        <w:t>Part 37 — ML Platform</w:t>
+      </w:r>
+    </w:p>
+    <w:p>
+      <w:pPr>
+        <w:pStyle w:val="ListBullet"/>
+      </w:pPr>
+      <w:r>
+        <w:t>Demand forecasting, cancellation prediction, fraud scoring, recommendation, anomaly.</w:t>
+      </w:r>
+    </w:p>
+    <w:p>
+      <w:pPr>
+        <w:pStyle w:val="ListBullet"/>
+      </w:pPr>
+      <w:r>
+        <w:t>Pure-Java/Python deterministic implementations (no heavy runtime dependency) + pluggable.</w:t>
+      </w:r>
+    </w:p>
+    <w:p>
+      <w:pPr>
+        <w:pStyle w:val="Heading3"/>
+      </w:pPr>
+      <w:r>
+        <w:t>Part 38 — Event-Driven Architecture</w:t>
+      </w:r>
+    </w:p>
+    <w:p>
+      <w:pPr>
+        <w:pStyle w:val="ListBullet"/>
+      </w:pPr>
+      <w:r>
+        <w:t>Outbox-style event emission on domain events; async consumers/scheduler.</w:t>
+      </w:r>
+    </w:p>
+    <w:p>
+      <w:pPr>
+        <w:pStyle w:val="Heading3"/>
+      </w:pPr>
+      <w:r>
+        <w:t>Part 39 — Microservices Architecture</w:t>
+      </w:r>
+    </w:p>
+    <w:p>
+      <w:pPr>
+        <w:pStyle w:val="ListBullet"/>
+      </w:pPr>
+      <w:r>
+        <w:t>Modular single-core delivered this build; microservice-ready boundaries (identity,</w:t>
+      </w:r>
+    </w:p>
+    <w:p>
+      <w:r>
+        <w:t>catalog, provider, search, inventory, reservation, booking, payment, ticket,</w:t>
+      </w:r>
+    </w:p>
+    <w:p>
+      <w:r>
+        <w:t>notification, fraud, analytics). Documented splitting path.</w:t>
+      </w:r>
+    </w:p>
+    <w:p>
+      <w:pPr>
+        <w:pStyle w:val="Heading3"/>
+      </w:pPr>
+      <w:r>
+        <w:t>Part 40 — API Gateway &amp; Edge</w:t>
+      </w:r>
+    </w:p>
+    <w:p>
+      <w:pPr>
+        <w:pStyle w:val="ListBullet"/>
+      </w:pPr>
+      <w:r>
+        <w:t>Central entry-point pattern, auth filter, tenant resolution, rate limiting, routing</w:t>
+      </w:r>
+    </w:p>
+    <w:p>
+      <w:r>
+        <w:t>contract. (In-service edge layer; dedicated gateway optional.)</w:t>
+      </w:r>
+    </w:p>
+    <w:p>
+      <w:pPr>
+        <w:pStyle w:val="Heading3"/>
+      </w:pPr>
+      <w:r>
+        <w:t>Part 41 — Security Architecture</w:t>
+      </w:r>
+    </w:p>
+    <w:p>
+      <w:pPr>
+        <w:pStyle w:val="ListBullet"/>
+      </w:pPr>
+      <w:r>
+        <w:t>OAuth2/JWT, RBAC (CUSTOMER/AGENT/ADMIN), tenant isolation, field-level redaction,</w:t>
+      </w:r>
+    </w:p>
+    <w:p>
+      <w:r>
+        <w:t>audit log, rate limiting, input validation, encryption, PII minimization, secrets via</w:t>
+      </w:r>
+    </w:p>
+    <w:p>
+      <w:r>
+        <w:t>env, security headers, CSRF-stateless API.</w:t>
+      </w:r>
+    </w:p>
+    <w:p>
+      <w:pPr>
+        <w:pStyle w:val="Heading3"/>
+      </w:pPr>
+      <w:r>
+        <w:t>Part 42 — AI Security</w:t>
+      </w:r>
+    </w:p>
+    <w:p>
+      <w:pPr>
+        <w:pStyle w:val="ListBullet"/>
+      </w:pPr>
+      <w:r>
+        <w:t>Prompt-injection defense, PII redaction, tool authorization, output validation,</w:t>
+      </w:r>
+    </w:p>
+    <w:p>
+      <w:r>
+        <w:t>retrieval filtering, model allowlist, audit, adversarial eval.</w:t>
+      </w:r>
+    </w:p>
+    <w:p>
+      <w:pPr>
+        <w:pStyle w:val="Heading3"/>
+      </w:pPr>
+      <w:r>
+        <w:t>Part 43 — DevOps / DevSecOps</w:t>
+      </w:r>
+    </w:p>
+    <w:p>
+      <w:pPr>
+        <w:pStyle w:val="ListBullet"/>
+      </w:pPr>
+      <w:r>
+        <w:t>CI, security pipeline (Gitleaks/OWASP/Checkov), release automation, IaC.</w:t>
+      </w:r>
+    </w:p>
+    <w:p>
+      <w:pPr>
+        <w:pStyle w:val="Heading3"/>
+      </w:pPr>
+      <w:r>
+        <w:t>Part 44 — CI/CD Pipeline</w:t>
+      </w:r>
+    </w:p>
+    <w:p>
+      <w:pPr>
+        <w:pStyle w:val="ListBullet"/>
+      </w:pPr>
+      <w:r>
+        <w:t>GitHub Actions CI (Java test + frontend build) on push/PR; security scans; release on tag.</w:t>
+      </w:r>
+    </w:p>
+    <w:p>
+      <w:pPr>
+        <w:pStyle w:val="Heading3"/>
+      </w:pPr>
+      <w:r>
+        <w:t>Part 45 — Kubernetes &amp; GitOps</w:t>
+      </w:r>
+    </w:p>
+    <w:p>
+      <w:pPr>
+        <w:pStyle w:val="ListBullet"/>
+      </w:pPr>
+      <w:r>
+        <w:t>K8s manifests + Helm chart + HPA autoscaling + optional Argo Rollouts.</w:t>
+      </w:r>
+    </w:p>
+    <w:p>
+      <w:pPr>
+        <w:pStyle w:val="Heading3"/>
+      </w:pPr>
+      <w:r>
+        <w:t>Part 46 — AWS Cloud Architecture</w:t>
+      </w:r>
+    </w:p>
+    <w:p>
+      <w:pPr>
+        <w:pStyle w:val="ListBullet"/>
+      </w:pPr>
+      <w:r>
+        <w:t>Terraform: ECS Fargate (or EKS), ALB, RDS, scaling policies, CloudWatch, IAM.</w:t>
+      </w:r>
+    </w:p>
+    <w:p>
+      <w:pPr>
+        <w:pStyle w:val="Heading3"/>
+      </w:pPr>
+      <w:r>
+        <w:t>Part 47 — Free / Offline Development</w:t>
+      </w:r>
+    </w:p>
+    <w:p>
+      <w:pPr>
+        <w:pStyle w:val="ListBullet"/>
+      </w:pPr>
+      <w:r>
+        <w:t>Offline AI model (deterministic), H2 in-memory DB for tests, WireMock provider/payment</w:t>
+      </w:r>
+    </w:p>
+    <w:p>
+      <w:r>
+        <w:t>stubs — start MVP without paid APIs.</w:t>
+      </w:r>
+    </w:p>
+    <w:p>
+      <w:pPr>
+        <w:pStyle w:val="Heading3"/>
+      </w:pPr>
+      <w:r>
+        <w:t>Part 48 — Frontend Web &amp; Mobile Strategy</w:t>
+      </w:r>
+    </w:p>
+    <w:p>
+      <w:pPr>
+        <w:pStyle w:val="ListBullet"/>
+      </w:pPr>
+      <w:r>
+        <w:t>Consumer Web (React + TypeScript PWA installable = web + app channel),</w:t>
+      </w:r>
+    </w:p>
+    <w:p>
+      <w:r>
+        <w:t>Agent shop portal, Admin portal. Responsive + PWA offline shell.</w:t>
+      </w:r>
+    </w:p>
+    <w:p>
+      <w:pPr>
+        <w:pStyle w:val="Heading3"/>
+      </w:pPr>
+      <w:r>
+        <w:t>Part 49 — Testing &amp; Quality</w:t>
+      </w:r>
+    </w:p>
+    <w:p>
+      <w:pPr>
+        <w:pStyle w:val="ListBullet"/>
+      </w:pPr>
+      <w:r>
+        <w:t>Unit tests (real assertions), integration tests, WireMock integration tests,</w:t>
+      </w:r>
+    </w:p>
+    <w:p>
+      <w:r>
+        <w:t>fraud/support/AI tests. Documented test strategy.</w:t>
+      </w:r>
+    </w:p>
+    <w:p>
+      <w:pPr>
+        <w:pStyle w:val="Heading3"/>
+      </w:pPr>
+      <w:r>
+        <w:t>Part 50 — Observability</w:t>
+      </w:r>
+    </w:p>
+    <w:p>
+      <w:pPr>
+        <w:pStyle w:val="ListBullet"/>
+      </w:pPr>
+      <w:r>
+        <w:t>Health endpoints, actuator metrics, structured logs, request tracing id, monitoring</w:t>
+      </w:r>
+    </w:p>
+    <w:p>
+      <w:r>
+        <w:t>docs + prometheus/grafana config.</w:t>
+      </w:r>
+    </w:p>
+    <w:p>
+      <w:pPr>
+        <w:pStyle w:val="Heading3"/>
+      </w:pPr>
+      <w:r>
+        <w:t>Part 51 — Repository / Git Format</w:t>
+      </w:r>
+    </w:p>
+    <w:p>
+      <w:pPr>
+        <w:pStyle w:val="ListBullet"/>
+      </w:pPr>
+      <w:r>
+        <w:t xml:space="preserve">Monorepo layout: </w:t>
+      </w:r>
+      <w:r>
+        <w:rPr>
+          <w:rFonts w:ascii="Consolas" w:hAnsi="Consolas"/>
+          <w:sz w:val="20"/>
+        </w:rPr>
+        <w:t>src</w:t>
+      </w:r>
+      <w:r>
+        <w:t xml:space="preserve"> (backend modules), </w:t>
+      </w:r>
+      <w:r>
+        <w:rPr>
+          <w:rFonts w:ascii="Consolas" w:hAnsi="Consolas"/>
+          <w:sz w:val="20"/>
+        </w:rPr>
+        <w:t>frontend</w:t>
+      </w:r>
+      <w:r>
+        <w:t xml:space="preserve">, </w:t>
+      </w:r>
+      <w:r>
+        <w:rPr>
+          <w:rFonts w:ascii="Consolas" w:hAnsi="Consolas"/>
+          <w:sz w:val="20"/>
+        </w:rPr>
+        <w:t>docs</w:t>
+      </w:r>
+      <w:r>
+        <w:t xml:space="preserve">, </w:t>
+      </w:r>
+      <w:r>
+        <w:rPr>
+          <w:rFonts w:ascii="Consolas" w:hAnsi="Consolas"/>
+          <w:sz w:val="20"/>
+        </w:rPr>
+        <w:t>infra</w:t>
+      </w:r>
+      <w:r>
+        <w:t xml:space="preserve">, </w:t>
+      </w:r>
+      <w:r>
+        <w:rPr>
+          <w:rFonts w:ascii="Consolas" w:hAnsi="Consolas"/>
+          <w:sz w:val="20"/>
+        </w:rPr>
+        <w:t>tools</w:t>
+      </w:r>
+      <w:r>
+        <w:t>, CI.</w:t>
+      </w:r>
+    </w:p>
+    <w:p>
+      <w:pPr>
+        <w:pStyle w:val="Heading3"/>
+      </w:pPr>
+      <w:r>
+        <w:t>Part 52 — Project Delivery Roadmap</w:t>
+      </w:r>
+    </w:p>
+    <w:p>
+      <w:pPr>
+        <w:pStyle w:val="ListBullet"/>
+      </w:pPr>
+      <w:r>
+        <w:t>Phased roadmap from MVP to production SaaS.</w:t>
+      </w:r>
+    </w:p>
+    <w:p>
+      <w:pPr>
+        <w:pStyle w:val="Heading3"/>
+      </w:pPr>
+      <w:r>
+        <w:t>Part 53 — MVP + Definition of Done + Portfolio Evidence</w:t>
+      </w:r>
+    </w:p>
+    <w:p>
+      <w:pPr>
+        <w:pStyle w:val="ListBullet"/>
+      </w:pPr>
+      <w:r>
+        <w:t>MVP scope, Definition of Done, and portfolio/evidence artifacts.</w:t>
       </w:r>
     </w:p>
     <w:p>
@@ -354,7 +1624,7 @@
         <w:t>Customer / Agent / Admin</w:t>
       </w:r>
       <w:r>
-        <w:t xml:space="preserve"> users must all exist.</w:t>
+        <w:t xml:space="preserve"> roles all exist.</w:t>
       </w:r>
     </w:p>
     <w:p>
@@ -371,7 +1641,7 @@
         <w:t>shop / agent</w:t>
       </w:r>
       <w:r>
-        <w:t xml:space="preserve"> can connect its service to the platform and give/sell to customers.</w:t>
+        <w:t xml:space="preserve"> can connect its service and sell to customers.</w:t>
       </w:r>
     </w:p>
     <w:p>
@@ -405,34 +1675,31 @@
         <w:t>ticket details and services</w:t>
       </w:r>
       <w:r>
-        <w:t>, sell</w:t>
+        <w:t>, publish</w:t>
       </w:r>
     </w:p>
     <w:p>
       <w:r>
-        <w:t>tickets to customers.</w:t>
+        <w:t>products to sell tickets to customers.</w:t>
       </w:r>
     </w:p>
     <w:p>
       <w:pPr>
         <w:pStyle w:val="ListBullet"/>
       </w:pPr>
-      <w:r>
-        <w:t xml:space="preserve">Shop owner can </w:t>
-      </w:r>
       <w:r>
         <w:rPr>
           <w:b/>
         </w:rPr>
-        <w:t>build/manage their shop using just their app</w:t>
-      </w:r>
-      <w:r>
-        <w:t>; admin manages overall and</w:t>
+        <w:t>Shop owner can build/manage their shop using just their app</w:t>
+      </w:r>
+      <w:r>
+        <w:t>; admin manages overall</w:t>
       </w:r>
     </w:p>
     <w:p>
       <w:r>
-        <w:t xml:space="preserve">can </w:t>
+        <w:t xml:space="preserve">and can </w:t>
       </w:r>
       <w:r>
         <w:rPr>
@@ -446,6 +1713,14 @@
     </w:p>
     <w:p>
       <w:pPr>
+        <w:pStyle w:val="ListBullet"/>
+      </w:pPr>
+      <w:r>
+        <w:t>Shop self-service: publish product + inventory + seat info + price from the agent app.</w:t>
+      </w:r>
+    </w:p>
+    <w:p>
+      <w:pPr>
         <w:pStyle w:val="Heading3"/>
       </w:pPr>
       <w:r>
@@ -491,7 +1766,69 @@
         <w:t>logo</w:t>
       </w:r>
       <w:r>
-        <w:t>, and anything else the shop needs to change — purely via configuration (no code).</w:t>
+        <w:t>, typography, and anything else the shop needs — purely via configuration (no code).</w:t>
+      </w:r>
+    </w:p>
+    <w:p>
+      <w:pPr>
+        <w:pStyle w:val="ListBullet"/>
+      </w:pPr>
+      <w:r>
+        <w:rPr>
+          <w:b/>
+        </w:rPr>
+        <w:t>Multi-currency</w:t>
+      </w:r>
+      <w:r>
+        <w:t xml:space="preserve"> first-class (</w:t>
+      </w:r>
+      <w:r>
+        <w:rPr>
+          <w:rFonts w:ascii="Consolas" w:hAnsi="Consolas"/>
+          <w:sz w:val="20"/>
+        </w:rPr>
+        <w:t>CurrencyAmount</w:t>
+      </w:r>
+      <w:r>
+        <w:t xml:space="preserve"> = currency code + amount; per-tenant</w:t>
+      </w:r>
+    </w:p>
+    <w:p>
+      <w:r>
+        <w:t>default currency; configurable exchange).</w:t>
+      </w:r>
+    </w:p>
+    <w:p>
+      <w:pPr>
+        <w:pStyle w:val="ListBullet"/>
+      </w:pPr>
+      <w:r>
+        <w:rPr>
+          <w:b/>
+        </w:rPr>
+        <w:t>Multi-language / i18n</w:t>
+      </w:r>
+      <w:r>
+        <w:t xml:space="preserve"> first-class (per-tenant default locale + region/country;</w:t>
+      </w:r>
+    </w:p>
+    <w:p>
+      <w:r>
+        <w:t>translation dictionaries; client-selectable language).</w:t>
+      </w:r>
+    </w:p>
+    <w:p>
+      <w:pPr>
+        <w:pStyle w:val="ListBullet"/>
+      </w:pPr>
+      <w:r>
+        <w:rPr>
+          <w:b/>
+        </w:rPr>
+        <w:t>Country / region</w:t>
+      </w:r>
+      <w:r>
+        <w:t xml:space="preserve"> scoping (per-tenant country, currency, locale).</w:t>
       </w:r>
     </w:p>
     <w:p>
@@ -538,7 +1875,27 @@
         <w:pStyle w:val="ListBullet"/>
       </w:pPr>
       <w:r>
-        <w:t>Admin portal for overall management + monitoring.</w:t>
+        <w:rPr>
+          <w:b/>
+        </w:rPr>
+        <w:t>Agent shop portal</w:t>
+      </w:r>
+      <w:r>
+        <w:t xml:space="preserve"> for shop owners to manage their shop &amp; publish products.</w:t>
+      </w:r>
+    </w:p>
+    <w:p>
+      <w:pPr>
+        <w:pStyle w:val="ListBullet"/>
+      </w:pPr>
+      <w:r>
+        <w:rPr>
+          <w:b/>
+        </w:rPr>
+        <w:t>Admin portal</w:t>
+      </w:r>
+      <w:r>
+        <w:t xml:space="preserve"> for overall management + monitoring.</w:t>
       </w:r>
     </w:p>
     <w:p>
@@ -631,12 +1988,7 @@
         <w:t>WireMock</w:t>
       </w:r>
       <w:r>
-        <w:t xml:space="preserve"> for offline provider/API stubbing where anything cannot connect</w:t>
-      </w:r>
-    </w:p>
-    <w:p>
-      <w:r>
-        <w:t>immediately.</w:t>
+        <w:t xml:space="preserve"> for offline provider/payment stubbing where anything cannot connect.</w:t>
       </w:r>
     </w:p>
     <w:p>
@@ -701,16 +2053,16 @@
         <w:pStyle w:val="ListBullet"/>
       </w:pPr>
       <w:r>
-        <w:t xml:space="preserve">Consider and include </w:t>
+        <w:t xml:space="preserve">Include all </w:t>
       </w:r>
       <w:r>
         <w:rPr>
           <w:b/>
         </w:rPr>
-        <w:t>all e-services needed for a production application</w:t>
-      </w:r>
-      <w:r>
-        <w:t xml:space="preserve"> — build them all.</w:t>
+        <w:t>e-services</w:t>
+      </w:r>
+      <w:r>
+        <w:t xml:space="preserve"> needed for a production application.</w:t>
       </w:r>
     </w:p>
     <w:p>
@@ -736,18 +2088,12 @@
         <w:t>QA release notes</w:t>
       </w:r>
       <w:r>
-        <w:t>, and any document needed</w:t>
+        <w:t>, and every document needed</w:t>
       </w:r>
     </w:p>
     <w:p>
       <w:r>
-        <w:rPr>
-          <w:b/>
-        </w:rPr>
-        <w:t>start-to-end</w:t>
-      </w:r>
-      <w:r>
-        <w:t xml:space="preserve"> — prepare them all: architecture diagrams, manuals, </w:t>
+        <w:t xml:space="preserve">start-to-end: architecture diagrams, manuals, </w:t>
       </w:r>
       <w:r>
         <w:rPr>
@@ -756,21 +2102,7 @@
         <w:t>SDLC process</w:t>
       </w:r>
       <w:r>
-        <w:t>,</w:t>
-      </w:r>
-    </w:p>
-    <w:p>
-      <w:r>
-        <w:t xml:space="preserve">as a </w:t>
-      </w:r>
-      <w:r>
-        <w:rPr>
-          <w:b/>
-        </w:rPr>
-        <w:t>standard company</w:t>
-      </w:r>
-      <w:r>
-        <w:t>.</w:t>
+        <w:t>, as a standard company.</w:t>
       </w:r>
     </w:p>
     <w:p>
@@ -792,7 +2124,7 @@
         <w:t>Auto-detect issues</w:t>
       </w:r>
       <w:r>
-        <w:t xml:space="preserve"> (live + dev + QA issues).</w:t>
+        <w:t xml:space="preserve"> (live + dev + QA).</w:t>
       </w:r>
     </w:p>
     <w:p>
@@ -820,7 +2152,7 @@
         <w:t>Auto-fix</w:t>
       </w:r>
       <w:r>
-        <w:t xml:space="preserve"> live issues, dev issues and QA issues.</w:t>
+        <w:t xml:space="preserve"> live, dev and QA issues where feasible.</w:t>
       </w:r>
     </w:p>
     <w:p>
@@ -850,7 +2182,7 @@
         <w:pStyle w:val="Heading2"/>
       </w:pPr>
       <w:r>
-        <w:t>3. Product-name &amp; business direction guidance (user asked for suggestion)</w:t>
+        <w:t>3. Product-name &amp; business direction guidance</w:t>
       </w:r>
     </w:p>
     <w:p>
@@ -858,7 +2190,7 @@
         <w:pStyle w:val="ListBullet"/>
       </w:pPr>
       <w:r>
-        <w:t xml:space="preserve">Blueprint name: </w:t>
+        <w:t xml:space="preserve">Blueprint product name: </w:t>
       </w:r>
       <w:r>
         <w:rPr>
@@ -867,7 +2199,7 @@
         <w:t>TicketMesh</w:t>
       </w:r>
       <w:r>
-        <w:t>.</w:t>
+        <w:t xml:space="preserve"> — "All your tickets, one platform."</w:t>
       </w:r>
     </w:p>
     <w:p>
@@ -875,80 +2207,25 @@
         <w:pStyle w:val="ListBullet"/>
       </w:pPr>
       <w:r>
-        <w:t xml:space="preserve">Recommended platform brand: </w:t>
-      </w:r>
-      <w:r>
-        <w:rPr>
-          <w:b/>
-        </w:rPr>
-        <w:t>TicketMesh</w:t>
-      </w:r>
-      <w:r>
-        <w:t xml:space="preserve"> (keeps blueprint continuity, professional,</w:t>
+        <w:t>Multi-product company portfolio later (e-commerce, hotel, e-channel, fintech, daycare,</w:t>
       </w:r>
     </w:p>
     <w:p>
       <w:r>
-        <w:t>sellable). Tagline: "All your tickets, one platform."</w:t>
+        <w:t>learning, care, portals, apps) — all reuse the same **platform prompt + architecture +</w:t>
       </w:r>
     </w:p>
     <w:p>
-      <w:pPr>
-        <w:pStyle w:val="ListBullet"/>
-      </w:pPr>
-      <w:r>
-        <w:t xml:space="preserve">The user additionally wants a </w:t>
-      </w:r>
-      <w:r>
-        <w:rPr>
-          <w:b/>
-        </w:rPr>
-        <w:t>multi-product company/portfolio</w:t>
-      </w:r>
-      <w:r>
-        <w:t xml:space="preserve"> later: e-commerce,</w:t>
+      <w:r>
+        <w:t>docs**. Ticketing is built first; each product mirrors it.</w:t>
       </w:r>
     </w:p>
     <w:p>
-      <w:r>
-        <w:t>e-hotel management, e-channel, fintech/lending platforms, daycare platform, learning</w:t>
-      </w:r>
-    </w:p>
-    <w:p>
-      <w:r>
-        <w:t>platform, elder-care/child-care, company sites, web portals, apps, portfolios — all</w:t>
-      </w:r>
-    </w:p>
-    <w:p>
-      <w:r>
-        <w:t>connected to WhatsApp/LinkedIn/Facebook (multi-channel). Ticketing is built first; the</w:t>
-      </w:r>
-    </w:p>
-    <w:p>
-      <w:r>
-        <w:t xml:space="preserve">same reusable </w:t>
-      </w:r>
-      <w:r>
-        <w:rPr>
-          <w:b/>
-        </w:rPr>
-        <w:t>platform prompt + architecture + docs</w:t>
-      </w:r>
-      <w:r>
-        <w:t xml:space="preserve"> will be reused for each.</w:t>
-      </w:r>
-    </w:p>
-    <w:p>
       <w:pPr>
         <w:pStyle w:val="ListBullet"/>
       </w:pPr>
       <w:r>
-        <w:t>Sell through multiple places (like WordPress marketplace model): SaaS marketplace, theme</w:t>
-      </w:r>
-    </w:p>
-    <w:p>
-      <w:r>
-        <w:t>marketplace, managed-service offering, on-prem licensing.</w:t>
+        <w:t>Sell through multiple channels like the WordPress marketplace model.</w:t>
       </w:r>
     </w:p>
     <w:p>
@@ -999,12 +2276,17 @@
     </w:p>
     <w:p>
       <w:r>
-        <w:t>within-core module boundaries. This keeps the build coherent and shippable while remaining</w:t>
+        <w:t>within-core module boundaries (identity, catalog, provider, search, inventory,</w:t>
       </w:r>
     </w:p>
     <w:p>
       <w:r>
-        <w:t>microservice-ready (splitting later is a boundary refactor, not a rewrite).</w:t>
+        <w:t>reservation, booking, payment, ticket, notification, fraud, analytics, AI/ML). This</w:t>
+      </w:r>
+    </w:p>
+    <w:p>
+      <w:r>
+        <w:t>stays coherent and shippable while remaining microservice-ready.</w:t>
       </w:r>
     </w:p>
     <w:p>
@@ -1028,22 +2310,7 @@
         <w:t>docs/blueprint-coverage.md</w:t>
       </w:r>
       <w:r>
-        <w:t xml:space="preserve"> for the honest per-part status of</w:t>
-      </w:r>
-    </w:p>
-    <w:p>
-      <w:r>
-        <w:t>the 53+ part master blueprint (BUILT / PARTIAL / DOC). It lists which parts are fully</w:t>
-      </w:r>
-    </w:p>
-    <w:p>
-      <w:r>
-        <w:t>implemented + tested, which are represented by the modular/config/adapter surface, and</w:t>
-      </w:r>
-    </w:p>
-    <w:p>
-      <w:r>
-        <w:t>which are documented as planned.</w:t>
+        <w:t xml:space="preserve"> for the honest per-part status.</w:t>
       </w:r>
     </w:p>
     <w:p>

</xml_diff>